<commit_message>
Update Actividad 1 - Identificar el proyecto tecnológico a trabajar FIN.docx
</commit_message>
<xml_diff>
--- a/Actividad 1 - Identificar el proyecto tecnológico a trabajar FIN.docx
+++ b/Actividad 1 - Identificar el proyecto tecnológico a trabajar FIN.docx
@@ -7235,13 +7235,7 @@
         <w:pStyle w:val="Apa7"/>
       </w:pPr>
       <w:r>
-        <w:t>El proyecto de una tienda virtual agroecológica de kits alimentarios se justifica porque responde a una necesidad real de los consumidores urbanos y a los retos de comercialización de los pequeños agricultores. Además, contribuye a los Objetivos de Desarrollo Sostenible, en particular al ODS 2 (Hambre Cero) es cual busca incentivar una reforma tanto agraria como alimentaria que no sobreexplote y degrade el medio ambiente. Este enfoque también ayuda a que se pueda seguir extrayendo recursos alimentarios de manera prolongada en el tiempo</w:t>
-      </w:r>
-      <w:r>
-        <w:t xml:space="preserve"> </w:t>
-      </w:r>
-      <w:r>
-        <w:t>y ODS 12 (Producción y Consumo Responsables) que se enfoca a través de un modelo más sostenible con una visión de economía circular y local.</w:t>
+        <w:t>El proyecto de una tienda virtual agroecológica de kits alimentarios se justifica porque responde a una necesidad real de los consumidores urbanos y a los retos de comercialización de los pequeños agricultores. Además, contribuye a los Objetivos de Desarrollo Sostenible, en particular al ODS 2 (Hambre Cero) es cual busca incentivar una reforma tanto agraria como alimentaria que no sobreexplote y degrade el medio ambiente. Este enfoque también ayuda a que se pueda seguir extrayendo recursos alimentarios de manera prolongada en el tiempo y ODS 12 (Producción y Consumo Responsables) que se enfoca a través de un modelo más sostenible con una visión de economía circular y local.</w:t>
       </w:r>
     </w:p>
     <w:p>
@@ -7252,17 +7246,12 @@
         <w:t xml:space="preserve">Como se menciona </w:t>
       </w:r>
       <w:proofErr w:type="spellStart"/>
-      <w:proofErr w:type="gramStart"/>
       <w:r>
         <w:t>Vargas,O</w:t>
       </w:r>
       <w:proofErr w:type="spellEnd"/>
-      <w:proofErr w:type="gramEnd"/>
-      <w:r>
-        <w:t xml:space="preserve"> (2021) debido a la problemática que se presentan los pequeños productores de esta zona, para vender sus productos a un precio justo y sin tener que asumir pérdidas en sus cosechas. Atendiendo la necesidad que surge, al implementar este modelo, se propone conectar a los del sector con los pequeños productores cercanos, para comercialización de la producción de alimentos cosechados, con el consumidor final.</w:t>
-      </w:r>
-      <w:r>
-        <w:t xml:space="preserve"> </w:t>
+      <w:r>
+        <w:t xml:space="preserve"> (2021) debido a la problemática que se presentan los pequeños productores de esta zona, para vender sus productos a un precio justo y sin tener que asumir pérdidas en sus cosechas. Atendiendo la necesidad que surge, al implementar este modelo, se propone conectar a los del sector con los pequeños productores cercanos, para comercialización de la producción de alimentos cosechados, con el consumidor final. </w:t>
       </w:r>
       <w:r>
         <w:t>El diseño y desarrollo de la aplicación móvil agroecológica se justifica por su impacto social, económico, tecnológico y ambiental, respondiendo de manera integral a los retos actuales del sistema agroalimentario en Bogotá y la Sabana Norte.</w:t>
@@ -10948,14 +10937,12 @@
         </w:rPr>
         <w:t xml:space="preserve">respuestas válidas, recolectadas durante el mes de </w:t>
       </w:r>
-      <w:proofErr w:type="gramStart"/>
       <w:r>
         <w:rPr>
           <w:lang w:val="es-ES"/>
         </w:rPr>
         <w:t>Octubre</w:t>
       </w:r>
-      <w:proofErr w:type="gramEnd"/>
       <w:r>
         <w:rPr>
           <w:lang w:val="es-ES"/>
@@ -12318,43 +12305,19 @@
         <w:rPr>
           <w:lang w:val="es-ES"/>
         </w:rPr>
-        <w:t xml:space="preserve">Se evidencia que el </w:t>
+        <w:t xml:space="preserve">Se evidencia que el 54% de las personas compran sus </w:t>
       </w:r>
       <w:r>
         <w:rPr>
           <w:lang w:val="es-ES"/>
         </w:rPr>
-        <w:t>54</w:t>
+        <w:t>productos agrícolas</w:t>
       </w:r>
       <w:r>
         <w:rPr>
           <w:lang w:val="es-ES"/>
         </w:rPr>
-        <w:t xml:space="preserve">% de las personas </w:t>
-      </w:r>
-      <w:r>
-        <w:rPr>
-          <w:lang w:val="es-ES"/>
-        </w:rPr>
-        <w:t xml:space="preserve">compran sus </w:t>
-      </w:r>
-      <w:r>
-        <w:rPr>
-          <w:lang w:val="es-ES"/>
-        </w:rPr>
-        <w:t>productos agrícolas</w:t>
-      </w:r>
-      <w:r>
-        <w:rPr>
-          <w:lang w:val="es-ES"/>
-        </w:rPr>
-        <w:t xml:space="preserve"> en supermercados</w:t>
-      </w:r>
-      <w:r>
-        <w:rPr>
-          <w:lang w:val="es-ES"/>
-        </w:rPr>
-        <w:t>, seguido del 2</w:t>
+        <w:t xml:space="preserve"> en supermercados, seguido del 2</w:t>
       </w:r>
       <w:r>
         <w:rPr>
@@ -12973,69 +12936,19 @@
         <w:rPr>
           <w:lang w:val="es-ES"/>
         </w:rPr>
-        <w:t xml:space="preserve">Se evidencia que </w:t>
-      </w:r>
-      <w:proofErr w:type="spellStart"/>
+        <w:t xml:space="preserve">Se evidencia que el 88% de las personas están interesadas en comprar frutas y verduras directamente del productor mediante una app y 2% no </w:t>
+      </w:r>
       <w:r>
         <w:rPr>
           <w:lang w:val="es-ES"/>
         </w:rPr>
-        <w:t>el</w:t>
-      </w:r>
-      <w:proofErr w:type="spellEnd"/>
+        <w:t>está</w:t>
+      </w:r>
       <w:r>
         <w:rPr>
           <w:lang w:val="es-ES"/>
         </w:rPr>
-        <w:t xml:space="preserve"> 88</w:t>
-      </w:r>
-      <w:r>
-        <w:rPr>
-          <w:lang w:val="es-ES"/>
-        </w:rPr>
-        <w:t xml:space="preserve">% de las personas </w:t>
-      </w:r>
-      <w:r>
-        <w:rPr>
-          <w:lang w:val="es-ES"/>
-        </w:rPr>
-        <w:t>están interesadas en comprar frutas y verduras directamente del productor mediante una app y</w:t>
-      </w:r>
-      <w:r>
-        <w:rPr>
-          <w:lang w:val="es-ES"/>
-        </w:rPr>
-        <w:t xml:space="preserve"> 2% </w:t>
-      </w:r>
-      <w:r>
-        <w:rPr>
-          <w:lang w:val="es-ES"/>
-        </w:rPr>
-        <w:t xml:space="preserve">no </w:t>
-      </w:r>
-      <w:r>
-        <w:rPr>
-          <w:lang w:val="es-ES"/>
-        </w:rPr>
-        <w:t>está</w:t>
-      </w:r>
-      <w:r>
-        <w:rPr>
-          <w:lang w:val="es-ES"/>
-        </w:rPr>
-        <w:t xml:space="preserve"> interesados</w:t>
-      </w:r>
-      <w:r>
-        <w:rPr>
-          <w:lang w:val="es-ES"/>
-        </w:rPr>
-        <w:t xml:space="preserve">, </w:t>
-      </w:r>
-      <w:r>
-        <w:rPr>
-          <w:lang w:val="es-ES"/>
-        </w:rPr>
-        <w:t xml:space="preserve">lo que evidencia </w:t>
+        <w:t xml:space="preserve"> interesados, lo que evidencia </w:t>
       </w:r>
       <w:r>
         <w:rPr>
@@ -13713,25 +13626,7 @@
         <w:rPr>
           <w:lang w:val="es-ES"/>
         </w:rPr>
-        <w:t xml:space="preserve">Se evidencia que el </w:t>
-      </w:r>
-      <w:r>
-        <w:rPr>
-          <w:lang w:val="es-ES"/>
-        </w:rPr>
-        <w:t>40</w:t>
-      </w:r>
-      <w:r>
-        <w:rPr>
-          <w:lang w:val="es-ES"/>
-        </w:rPr>
-        <w:t xml:space="preserve">% de las personas </w:t>
-      </w:r>
-      <w:r>
-        <w:rPr>
-          <w:lang w:val="es-ES"/>
-        </w:rPr>
-        <w:t>encuestadas valoran más la calidad de los productos que el resto de factores, el 32% que estén frescos, el 22% que los productos tengan un buen precio y el 6% que manejen entregas a domicilio. Lo que evidencia que la población en general es consciente de la importancia de la calidad del producto, sobre el resto de factores, tema que se puede trabajar y controlar al adquirir el producto directamente al agricultor, ya que serian productos de cosecha y que rotan de manera constante.</w:t>
+        <w:t>Se evidencia que el 40% de las personas encuestadas valoran más la calidad de los productos que el resto de factores, el 32% que estén frescos, el 22% que los productos tengan un buen precio y el 6% que manejen entregas a domicilio. Lo que evidencia que la población en general es consciente de la importancia de la calidad del producto, sobre el resto de factores, tema que se puede trabajar y controlar al adquirir el producto directamente al agricultor, ya que serian productos de cosecha y que rotan de manera constante.</w:t>
       </w:r>
     </w:p>
     <w:p>
@@ -14977,21 +14872,7 @@
         <w:rPr>
           <w:lang w:val="es-ES"/>
         </w:rPr>
-        <w:t xml:space="preserve">Se evidencia que </w:t>
-      </w:r>
-      <w:proofErr w:type="spellStart"/>
-      <w:r>
-        <w:rPr>
-          <w:lang w:val="es-ES"/>
-        </w:rPr>
-        <w:t>el</w:t>
-      </w:r>
-      <w:proofErr w:type="spellEnd"/>
-      <w:r>
-        <w:rPr>
-          <w:lang w:val="es-ES"/>
-        </w:rPr>
-        <w:t xml:space="preserve"> </w:t>
+        <w:t xml:space="preserve">Se evidencia que el </w:t>
       </w:r>
       <w:r>
         <w:rPr>
@@ -21341,15 +21222,7 @@
         <w:pStyle w:val="Apa7"/>
       </w:pPr>
       <w:r>
-        <w:t xml:space="preserve">A </w:t>
-      </w:r>
-      <w:proofErr w:type="gramStart"/>
-      <w:r>
-        <w:t>continuación</w:t>
-      </w:r>
-      <w:proofErr w:type="gramEnd"/>
-      <w:r>
-        <w:t xml:space="preserve"> se presenta el Product Backlog, el cual recoge todas las tareas y funcionalidades priorizadas del sistema:</w:t>
+        <w:t>A continuación se presenta el Product Backlog, el cual recoge todas las tareas y funcionalidades priorizadas del sistema:</w:t>
       </w:r>
     </w:p>
     <w:p>
@@ -21657,7 +21530,16 @@
         <w:t>Link de repositorio</w:t>
       </w:r>
     </w:p>
-    <w:p/>
+    <w:p>
+      <w:hyperlink r:id="rId29" w:history="1">
+        <w:r>
+          <w:rPr>
+            <w:rStyle w:val="Hipervnculo"/>
+          </w:rPr>
+          <w:t>https://github.com/KarenGayon/ACTIVIDAD-1-Identificar-el-proyecto-tecnologico-a-trabajar</w:t>
+        </w:r>
+      </w:hyperlink>
+    </w:p>
     <w:p/>
     <w:p/>
     <w:p>
@@ -22059,15 +21941,7 @@
       </w:r>
       <w:proofErr w:type="spellEnd"/>
       <w:r>
-        <w:t xml:space="preserve"> de Catalunya.  Unidad 4: Lenguaje UML, página </w:t>
-      </w:r>
-      <w:proofErr w:type="gramStart"/>
-      <w:r>
-        <w:t>33  a</w:t>
-      </w:r>
-      <w:proofErr w:type="gramEnd"/>
-      <w:r>
-        <w:t xml:space="preserve"> la 60.</w:t>
+        <w:t xml:space="preserve"> de Catalunya.  Unidad 4: Lenguaje UML, página 33  a la 60.</w:t>
       </w:r>
     </w:p>
     <w:p>
@@ -22096,15 +21970,7 @@
       </w:r>
       <w:proofErr w:type="spellEnd"/>
       <w:r>
-        <w:t xml:space="preserve"> Hill. Capítulo 16: página 593 a la 627 y Capítulo 17, página 633 a </w:t>
-      </w:r>
-      <w:proofErr w:type="gramStart"/>
-      <w:r>
-        <w:t>la  665</w:t>
-      </w:r>
-      <w:proofErr w:type="gramEnd"/>
-      <w:r>
-        <w:t>.</w:t>
+        <w:t xml:space="preserve"> Hill. Capítulo 16: página 593 a la 627 y Capítulo 17, página 633 a la  665.</w:t>
       </w:r>
     </w:p>
     <w:p>
@@ -22114,19 +21980,11 @@
           <w:lang w:val="es-CO"/>
         </w:rPr>
       </w:pPr>
-      <w:proofErr w:type="gramStart"/>
       <w:r>
         <w:rPr>
           <w:lang w:val="es-CO"/>
         </w:rPr>
-        <w:t>  Ministerio</w:t>
-      </w:r>
-      <w:proofErr w:type="gramEnd"/>
-      <w:r>
-        <w:rPr>
-          <w:lang w:val="es-CO"/>
-        </w:rPr>
-        <w:t xml:space="preserve"> de Salud y Protección Social. (2012). </w:t>
+        <w:t xml:space="preserve">  Ministerio de Salud y Protección Social. (2012). </w:t>
       </w:r>
       <w:r>
         <w:rPr>
@@ -22164,19 +22022,11 @@
           <w:lang w:val="es-CO"/>
         </w:rPr>
       </w:pPr>
-      <w:proofErr w:type="gramStart"/>
       <w:r>
         <w:rPr>
           <w:lang w:val="es-CO"/>
         </w:rPr>
-        <w:t>  Instituto</w:t>
-      </w:r>
-      <w:proofErr w:type="gramEnd"/>
-      <w:r>
-        <w:rPr>
-          <w:lang w:val="es-CO"/>
-        </w:rPr>
-        <w:t xml:space="preserve"> Colombiano de Bienestar Familiar. (s.f.). </w:t>
+        <w:t xml:space="preserve">  Instituto Colombiano de Bienestar Familiar. (s.f.). </w:t>
       </w:r>
       <w:r>
         <w:rPr>
@@ -31907,6 +31757,7 @@
   <w:style w:type="character" w:default="1" w:styleId="Fuentedeprrafopredeter">
     <w:name w:val="Default Paragraph Font"/>
     <w:uiPriority w:val="1"/>
+    <w:semiHidden/>
     <w:unhideWhenUsed/>
   </w:style>
   <w:style w:type="table" w:default="1" w:styleId="Tablanormal">

</xml_diff>